<commit_message>
Soften Talay memo: careful initiatives and 90-day contour role
Revise applied digest for discussion: facts first, priority works as
natural next steps, gentle 90-day partnership framing, no confrontational
prompts. Align internal partnership playbook with the same tone.

Co-authored-by: AliVertnd <AliVertnd@users.noreply.github.com>
</commit_message>
<xml_diff>
--- a/docs/deliverables/word/19_модель_стратегического_партнёрства_талай.docx
+++ b/docs/deliverables/word/19_модель_стратегического_партнёрства_талай.docx
@@ -12,9 +12,9 @@
           <w:b/>
           <w:i w:val="0"/>
           <w:color w:val="1A1A1A"/>
-          <w:sz w:val="22"/>
+          <w:sz w:val="24"/>
         </w:rPr>
-        <w:t>IMPRO Group · внутренний документ</w:t>
+        <w:t>IMPRO × Сибирь Девелопмент</w:t>
       </w:r>
     </w:p>
     <w:p>
@@ -27,11 +27,9 @@
           <w:b/>
           <w:i w:val="0"/>
           <w:color w:val="1A1A1A"/>
-          <w:sz w:val="32"/>
+          <w:sz w:val="30"/>
         </w:rPr>
         <w:t>Модель стратегического партнёрства</w:t>
-        <w:br/>
-        <w:t>ЖК «Талай» × Сибирь Девелопмент</w:t>
       </w:r>
     </w:p>
     <w:p>
@@ -46,9 +44,7 @@
           <w:color w:val="1A1A1A"/>
           <w:sz w:val="20"/>
         </w:rPr>
-        <w:t>Мандат · экономика 250–350 + доборы · путь к одобрению</w:t>
-        <w:br/>
-        <w:t>05.08.2026</w:t>
+        <w:t>Мандат · экономика · мягкий путь к одобрению · 05.08.2026</w:t>
       </w:r>
     </w:p>
     <w:p/>
@@ -3095,7 +3091,7 @@
           <w:color w:val="1A1A1A"/>
           <w:sz w:val="24"/>
         </w:rPr>
-        <w:t>8.2. Сценарий встречи (45–60 минут)</w:t>
+        <w:t>8.2. Сценарий встречи (45–60 минут) — мягкий</w:t>
       </w:r>
     </w:p>
     <w:p>
@@ -3111,7 +3107,7 @@
           <w:color w:val="1A1A1A"/>
           <w:sz w:val="21"/>
         </w:rPr>
-        <w:t>Минуты 0–10. Факты без продажи.</w:t>
+        <w:t>Минуты 0–15. Факты.</w:t>
       </w:r>
       <w:r>
         <w:rPr>
@@ -3121,33 +3117,7 @@
           <w:color w:val="1A1A1A"/>
           <w:sz w:val="21"/>
         </w:rPr>
-        <w:t xml:space="preserve"> Из записки: ворота ≠ курорт; чек 9–11 млн не тянет средняя зарплата; 82,5% компакта; гейт 25 броней; −47,8% распроданности; честные 4–7,5% vs чужие 13–18%; посредников «сто» в рабочем смысле нет.</w:t>
-      </w:r>
-    </w:p>
-    <w:p>
-      <w:pPr>
-        <w:spacing w:after="120" w:before="0" w:line="276" w:lineRule="auto"/>
-        <w:ind w:firstLine="425"/>
-      </w:pPr>
-      <w:r>
-        <w:rPr>
-          <w:rFonts w:ascii="Times New Roman" w:hAnsi="Times New Roman" w:eastAsia="Times New Roman"/>
-          <w:b w:val="0"/>
-          <w:i/>
-          <w:color w:val="1A1A1A"/>
-          <w:sz w:val="21"/>
-        </w:rPr>
-        <w:t>Цель:</w:t>
-      </w:r>
-      <w:r>
-        <w:rPr>
-          <w:rFonts w:ascii="Times New Roman" w:hAnsi="Times New Roman" w:eastAsia="Times New Roman"/>
-          <w:b w:val="0"/>
-          <w:i w:val="0"/>
-          <w:color w:val="1A1A1A"/>
-          <w:sz w:val="21"/>
-        </w:rPr>
-        <w:t xml:space="preserve"> согласие с рамкой рынка.</w:t>
+        <w:t xml:space="preserve"> Вестись по прикладной записке v1.1, часть I. Без продажи. Цель — согласие с рамкой рынка.</w:t>
       </w:r>
     </w:p>
     <w:p>
@@ -3163,7 +3133,7 @@
           <w:color w:val="1A1A1A"/>
           <w:sz w:val="21"/>
         </w:rPr>
-        <w:t>Минуты 10–20. Разрыв.</w:t>
+        <w:t>Минуты 15–30. Приоритетные работы — очень аккуратно.</w:t>
       </w:r>
       <w:r>
         <w:rPr>
@@ -3173,7 +3143,39 @@
           <w:color w:val="1A1A1A"/>
           <w:sz w:val="21"/>
         </w:rPr>
-        <w:t xml:space="preserve"> Вопрос в зал: «Кто персонально каждую неделю сводит язык, учёт, агентства, подрядчиков и прогноз к 300 млн?» Если ответа нет — мандат уже логичен.</w:t>
+        <w:t xml:space="preserve"> Не «вам нужен держатель контура», а:</w:t>
+      </w:r>
+    </w:p>
+    <w:p>
+      <w:pPr>
+        <w:spacing w:after="120" w:before="120" w:line="276" w:lineRule="auto"/>
+        <w:ind w:left="567"/>
+      </w:pPr>
+      <w:r>
+        <w:rPr>
+          <w:rFonts w:ascii="Times New Roman" w:hAnsi="Times New Roman" w:eastAsia="Times New Roman"/>
+          <w:b w:val="0"/>
+          <w:i/>
+          <w:color w:val="1A1A1A"/>
+          <w:sz w:val="22"/>
+        </w:rPr>
+        <w:t>Из вашего плана запуска и этих фактов следует короткий список работ до пресейла. Их полезно не оставить между отделами.</w:t>
+      </w:r>
+    </w:p>
+    <w:p>
+      <w:pPr>
+        <w:spacing w:after="120" w:before="0" w:line="276" w:lineRule="auto"/>
+        <w:ind w:firstLine="425"/>
+      </w:pPr>
+      <w:r>
+        <w:rPr>
+          <w:rFonts w:ascii="Times New Roman" w:hAnsi="Times New Roman" w:eastAsia="Times New Roman"/>
+          <w:b w:val="0"/>
+          <w:i w:val="0"/>
+          <w:color w:val="1A1A1A"/>
+          <w:sz w:val="21"/>
+        </w:rPr>
+        <w:t>Показать минимум из семи пунктов записки (язык, юррамка, учёт, скрипты, пилот АН, ипотека 45 дней, прогноз к 25 броням). Тон: очередность работ под гейты, не объём «пакета услуг».</w:t>
       </w:r>
     </w:p>
     <w:p>
@@ -3189,37 +3191,7 @@
           <w:color w:val="1A1A1A"/>
           <w:sz w:val="21"/>
         </w:rPr>
-        <w:t>Минуты 20–35. Инициативы как доказательство объёма.</w:t>
-      </w:r>
-      <w:r>
-        <w:rPr>
-          <w:rFonts w:ascii="Times New Roman" w:hAnsi="Times New Roman" w:eastAsia="Times New Roman"/>
-          <w:b w:val="0"/>
-          <w:i w:val="0"/>
-          <w:color w:val="1A1A1A"/>
-          <w:sz w:val="21"/>
-        </w:rPr>
-        <w:t xml:space="preserve"> Показать не 50 пунктов, а </w:t>
-      </w:r>
-      <w:r>
-        <w:rPr>
-          <w:rFonts w:ascii="Times New Roman" w:hAnsi="Times New Roman" w:eastAsia="Times New Roman"/>
-          <w:b/>
-          <w:i w:val="0"/>
-          <w:color w:val="1A1A1A"/>
-          <w:sz w:val="21"/>
-        </w:rPr>
-        <w:t>топ-7 до 20 августа</w:t>
-      </w:r>
-      <w:r>
-        <w:rPr>
-          <w:rFonts w:ascii="Times New Roman" w:hAnsi="Times New Roman" w:eastAsia="Times New Roman"/>
-          <w:b w:val="0"/>
-          <w:i w:val="0"/>
-          <w:color w:val="1A1A1A"/>
-          <w:sz w:val="21"/>
-        </w:rPr>
-        <w:t xml:space="preserve"> и сказать:</w:t>
+        <w:t>Минуты 30–45. Контур на 90 дней.</w:t>
       </w:r>
     </w:p>
     <w:p>
@@ -3235,135 +3207,55 @@
           <w:color w:val="1A1A1A"/>
           <w:sz w:val="22"/>
         </w:rPr>
-        <w:t>Эти работы уже следуют из вашего же плана запуска. Их нельзя закрыть разовым сайтом и поисковым продвижением на 200 тыс. Нужен держатель контура.</w:t>
+        <w:t>IMPRO уже в связке с СД. На период запуска логично аккуратно расширить роль: стратегия языка, аналитика, учёт, пилот агентств, координация подрядчиков — рядом с вашей командой.</w:t>
       </w:r>
     </w:p>
     <w:p>
       <w:pPr>
-        <w:spacing w:after="120" w:before="0" w:line="276" w:lineRule="auto"/>
-        <w:ind w:firstLine="425"/>
+        <w:spacing w:after="120" w:before="120" w:line="276" w:lineRule="auto"/>
+        <w:ind w:left="567"/>
       </w:pPr>
       <w:r>
         <w:rPr>
           <w:rFonts w:ascii="Times New Roman" w:hAnsi="Times New Roman" w:eastAsia="Times New Roman"/>
           <w:b w:val="0"/>
-          <w:i w:val="0"/>
+          <w:i/>
           <w:color w:val="1A1A1A"/>
-          <w:sz w:val="21"/>
+          <w:sz w:val="22"/>
         </w:rPr>
-        <w:t>Список для стола:</w:t>
+        <w:t>База 250–350 тыс. как развитие текущего мандата.</w:t>
       </w:r>
     </w:p>
     <w:p>
       <w:pPr>
-        <w:pStyle w:val="ListNumber"/>
-        <w:spacing w:line="276" w:lineRule="auto" w:after="60"/>
+        <w:spacing w:after="120" w:before="120" w:line="276" w:lineRule="auto"/>
+        <w:ind w:left="567"/>
       </w:pPr>
       <w:r>
         <w:rPr>
           <w:rFonts w:ascii="Times New Roman" w:hAnsi="Times New Roman" w:eastAsia="Times New Roman"/>
           <w:b w:val="0"/>
-          <w:i w:val="0"/>
+          <w:i/>
           <w:color w:val="1A1A1A"/>
           <w:sz w:val="22"/>
         </w:rPr>
-        <w:t>язык и запреты;</w:t>
+        <w:t>Дополнительные руки — по задаче месяца.</w:t>
       </w:r>
     </w:p>
     <w:p>
       <w:pPr>
-        <w:pStyle w:val="ListNumber"/>
-        <w:spacing w:line="276" w:lineRule="auto" w:after="60"/>
+        <w:spacing w:after="120" w:before="120" w:line="276" w:lineRule="auto"/>
+        <w:ind w:left="567"/>
       </w:pPr>
       <w:r>
         <w:rPr>
           <w:rFonts w:ascii="Times New Roman" w:hAnsi="Times New Roman" w:eastAsia="Times New Roman"/>
           <w:b w:val="0"/>
-          <w:i w:val="0"/>
+          <w:i/>
           <w:color w:val="1A1A1A"/>
           <w:sz w:val="22"/>
         </w:rPr>
-        <w:t>юррамка рекламы;</w:t>
-      </w:r>
-    </w:p>
-    <w:p>
-      <w:pPr>
-        <w:pStyle w:val="ListNumber"/>
-        <w:spacing w:line="276" w:lineRule="auto" w:after="60"/>
-      </w:pPr>
-      <w:r>
-        <w:rPr>
-          <w:rFonts w:ascii="Times New Roman" w:hAnsi="Times New Roman" w:eastAsia="Times New Roman"/>
-          <w:b w:val="0"/>
-          <w:i w:val="0"/>
-          <w:color w:val="1A1A1A"/>
-          <w:sz w:val="22"/>
-        </w:rPr>
-        <w:t>учёт броней и метки;</w:t>
-      </w:r>
-    </w:p>
-    <w:p>
-      <w:pPr>
-        <w:pStyle w:val="ListNumber"/>
-        <w:spacing w:line="276" w:lineRule="auto" w:after="60"/>
-      </w:pPr>
-      <w:r>
-        <w:rPr>
-          <w:rFonts w:ascii="Times New Roman" w:hAnsi="Times New Roman" w:eastAsia="Times New Roman"/>
-          <w:b w:val="0"/>
-          <w:i w:val="0"/>
-          <w:color w:val="1A1A1A"/>
-          <w:sz w:val="22"/>
-        </w:rPr>
-        <w:t>скрипты отдела продаж;</w:t>
-      </w:r>
-    </w:p>
-    <w:p>
-      <w:pPr>
-        <w:pStyle w:val="ListNumber"/>
-        <w:spacing w:line="276" w:lineRule="auto" w:after="60"/>
-      </w:pPr>
-      <w:r>
-        <w:rPr>
-          <w:rFonts w:ascii="Times New Roman" w:hAnsi="Times New Roman" w:eastAsia="Times New Roman"/>
-          <w:b w:val="0"/>
-          <w:i w:val="0"/>
-          <w:color w:val="1A1A1A"/>
-          <w:sz w:val="22"/>
-        </w:rPr>
-        <w:t>пилот 2–3 агентства;</w:t>
-      </w:r>
-    </w:p>
-    <w:p>
-      <w:pPr>
-        <w:pStyle w:val="ListNumber"/>
-        <w:spacing w:line="276" w:lineRule="auto" w:after="60"/>
-      </w:pPr>
-      <w:r>
-        <w:rPr>
-          <w:rFonts w:ascii="Times New Roman" w:hAnsi="Times New Roman" w:eastAsia="Times New Roman"/>
-          <w:b w:val="0"/>
-          <w:i w:val="0"/>
-          <w:color w:val="1A1A1A"/>
-          <w:sz w:val="22"/>
-        </w:rPr>
-        <w:t>ипотечный контур 45 дней;</w:t>
-      </w:r>
-    </w:p>
-    <w:p>
-      <w:pPr>
-        <w:pStyle w:val="ListNumber"/>
-        <w:spacing w:line="276" w:lineRule="auto" w:after="60"/>
-      </w:pPr>
-      <w:r>
-        <w:rPr>
-          <w:rFonts w:ascii="Times New Roman" w:hAnsi="Times New Roman" w:eastAsia="Times New Roman"/>
-          <w:b w:val="0"/>
-          <w:i w:val="0"/>
-          <w:color w:val="1A1A1A"/>
-          <w:sz w:val="22"/>
-        </w:rPr>
-        <w:t>еженедельный прогноз и штаб.</w:t>
+        <w:t>Успех удобнее связать с гейтами, не с процентом со всех договоров.</w:t>
       </w:r>
     </w:p>
     <w:p>
@@ -3379,87 +3271,7 @@
           <w:color w:val="1A1A1A"/>
           <w:sz w:val="21"/>
         </w:rPr>
-        <w:t>Минуты 35–45. Предложение роли, не прайса.</w:t>
-      </w:r>
-    </w:p>
-    <w:p>
-      <w:pPr>
-        <w:spacing w:after="120" w:before="120" w:line="276" w:lineRule="auto"/>
-        <w:ind w:left="567"/>
-      </w:pPr>
-      <w:r>
-        <w:rPr>
-          <w:rFonts w:ascii="Times New Roman" w:hAnsi="Times New Roman" w:eastAsia="Times New Roman"/>
-          <w:b w:val="0"/>
-          <w:i/>
-          <w:color w:val="1A1A1A"/>
-          <w:sz w:val="22"/>
-        </w:rPr>
-        <w:t>На 90 дней IMPRO берёт роль стратегического партнёра по контуру: стратегия, аналитика, IT-архитектура, агентства, подряд.</w:t>
-      </w:r>
-    </w:p>
-    <w:p>
-      <w:pPr>
-        <w:spacing w:after="120" w:before="120" w:line="276" w:lineRule="auto"/>
-        <w:ind w:left="567"/>
-      </w:pPr>
-      <w:r>
-        <w:rPr>
-          <w:rFonts w:ascii="Times New Roman" w:hAnsi="Times New Roman" w:eastAsia="Times New Roman"/>
-          <w:b w:val="0"/>
-          <w:i/>
-          <w:color w:val="1A1A1A"/>
-          <w:sz w:val="22"/>
-        </w:rPr>
-        <w:t>База 250–350 тыс. (апгрейд с текущих ~200).</w:t>
-      </w:r>
-    </w:p>
-    <w:p>
-      <w:pPr>
-        <w:spacing w:after="120" w:before="120" w:line="276" w:lineRule="auto"/>
-        <w:ind w:left="567"/>
-      </w:pPr>
-      <w:r>
-        <w:rPr>
-          <w:rFonts w:ascii="Times New Roman" w:hAnsi="Times New Roman" w:eastAsia="Times New Roman"/>
-          <w:b w:val="0"/>
-          <w:i/>
-          <w:color w:val="1A1A1A"/>
-          <w:sz w:val="22"/>
-        </w:rPr>
-        <w:t>Руки месяца — добором.</w:t>
-      </w:r>
-    </w:p>
-    <w:p>
-      <w:pPr>
-        <w:spacing w:after="120" w:before="120" w:line="276" w:lineRule="auto"/>
-        <w:ind w:left="567"/>
-      </w:pPr>
-      <w:r>
-        <w:rPr>
-          <w:rFonts w:ascii="Times New Roman" w:hAnsi="Times New Roman" w:eastAsia="Times New Roman"/>
-          <w:b w:val="0"/>
-          <w:i/>
-          <w:color w:val="1A1A1A"/>
-          <w:sz w:val="22"/>
-        </w:rPr>
-        <w:t>Успех — по гейтам, не процент со всех договоров.</w:t>
-      </w:r>
-    </w:p>
-    <w:p>
-      <w:pPr>
-        <w:spacing w:after="120" w:before="0" w:line="276" w:lineRule="auto"/>
-        <w:ind w:firstLine="425"/>
-      </w:pPr>
-      <w:r>
-        <w:rPr>
-          <w:rFonts w:ascii="Times New Roman" w:hAnsi="Times New Roman" w:eastAsia="Times New Roman"/>
-          <w:b/>
-          <w:i w:val="0"/>
-          <w:color w:val="1A1A1A"/>
-          <w:sz w:val="21"/>
-        </w:rPr>
-        <w:t>Минуты 45–60. Решение в протокол.</w:t>
+        <w:t>Минуты 45–60. Фиксация.</w:t>
       </w:r>
       <w:r>
         <w:rPr>
@@ -3469,103 +3281,7 @@
           <w:color w:val="1A1A1A"/>
           <w:sz w:val="21"/>
         </w:rPr>
-        <w:t xml:space="preserve"> Зафиксировать письменно:</w:t>
-      </w:r>
-    </w:p>
-    <w:p>
-      <w:pPr>
-        <w:pStyle w:val="ListBullet"/>
-        <w:spacing w:line="276" w:lineRule="auto" w:after="60"/>
-      </w:pPr>
-      <w:r>
-        <w:rPr>
-          <w:rFonts w:ascii="Times New Roman" w:hAnsi="Times New Roman" w:eastAsia="Times New Roman"/>
-          <w:b w:val="0"/>
-          <w:i w:val="0"/>
-          <w:color w:val="1A1A1A"/>
-          <w:sz w:val="22"/>
-        </w:rPr>
-        <w:t>да / нет роли на 90 дней;</w:t>
-      </w:r>
-    </w:p>
-    <w:p>
-      <w:pPr>
-        <w:pStyle w:val="ListBullet"/>
-        <w:spacing w:line="276" w:lineRule="auto" w:after="60"/>
-      </w:pPr>
-      <w:r>
-        <w:rPr>
-          <w:rFonts w:ascii="Times New Roman" w:hAnsi="Times New Roman" w:eastAsia="Times New Roman"/>
-          <w:b w:val="0"/>
-          <w:i w:val="0"/>
-          <w:color w:val="1A1A1A"/>
-          <w:sz w:val="22"/>
-        </w:rPr>
-        <w:t>состав ядра;</w:t>
-      </w:r>
-    </w:p>
-    <w:p>
-      <w:pPr>
-        <w:pStyle w:val="ListBullet"/>
-        <w:spacing w:line="276" w:lineRule="auto" w:after="60"/>
-      </w:pPr>
-      <w:r>
-        <w:rPr>
-          <w:rFonts w:ascii="Times New Roman" w:hAnsi="Times New Roman" w:eastAsia="Times New Roman"/>
-          <w:b w:val="0"/>
-          <w:i w:val="0"/>
-          <w:color w:val="1A1A1A"/>
-          <w:sz w:val="22"/>
-        </w:rPr>
-        <w:t>лимит доборов на август–сентябрь;</w:t>
-      </w:r>
-    </w:p>
-    <w:p>
-      <w:pPr>
-        <w:pStyle w:val="ListBullet"/>
-        <w:spacing w:line="276" w:lineRule="auto" w:after="60"/>
-      </w:pPr>
-      <w:r>
-        <w:rPr>
-          <w:rFonts w:ascii="Times New Roman" w:hAnsi="Times New Roman" w:eastAsia="Times New Roman"/>
-          <w:b w:val="0"/>
-          <w:i w:val="0"/>
-          <w:color w:val="1A1A1A"/>
-          <w:sz w:val="22"/>
-        </w:rPr>
-        <w:t>дата штаба;</w:t>
-      </w:r>
-    </w:p>
-    <w:p>
-      <w:pPr>
-        <w:pStyle w:val="ListBullet"/>
-        <w:spacing w:line="276" w:lineRule="auto" w:after="60"/>
-      </w:pPr>
-      <w:r>
-        <w:rPr>
-          <w:rFonts w:ascii="Times New Roman" w:hAnsi="Times New Roman" w:eastAsia="Times New Roman"/>
-          <w:b w:val="0"/>
-          <w:i w:val="0"/>
-          <w:color w:val="1A1A1A"/>
-          <w:sz w:val="22"/>
-        </w:rPr>
-        <w:t>кто открывает доступ к учёту и звонкам;</w:t>
-      </w:r>
-    </w:p>
-    <w:p>
-      <w:pPr>
-        <w:pStyle w:val="ListBullet"/>
-        <w:spacing w:line="276" w:lineRule="auto" w:after="60"/>
-      </w:pPr>
-      <w:r>
-        <w:rPr>
-          <w:rFonts w:ascii="Times New Roman" w:hAnsi="Times New Roman" w:eastAsia="Times New Roman"/>
-          <w:b w:val="0"/>
-          <w:i w:val="0"/>
-          <w:color w:val="1A1A1A"/>
-          <w:sz w:val="22"/>
-        </w:rPr>
-        <w:t>зачёт уже сделанной аналитики в первый месяц.</w:t>
+        <w:t xml:space="preserve"> Короткий протокол: согласны ли усилить контур на 90 дней; коридор базы; дата штаба; доступы; зачёт аналитики в первый месяц. Без жёсткого допроса «кто у вас за это отвечает».</w:t>
       </w:r>
     </w:p>
     <w:p>
@@ -3594,7 +3310,7 @@
           <w:color w:val="1A1A1A"/>
           <w:sz w:val="22"/>
         </w:rPr>
-        <w:t>Связка с их KPI.</w:t>
+        <w:t>Сначала факты</w:t>
       </w:r>
       <w:r>
         <w:rPr>
@@ -3604,7 +3320,7 @@
           <w:color w:val="1A1A1A"/>
           <w:sz w:val="22"/>
         </w:rPr>
-        <w:t xml:space="preserve"> Каждая рекомендация записки → риск срыва 25 броней / 300 млн.</w:t>
+        <w:t xml:space="preserve"> — согласие с рамкой без разговора о деньгах.</w:t>
       </w:r>
     </w:p>
     <w:p>
@@ -3620,7 +3336,7 @@
           <w:color w:val="1A1A1A"/>
           <w:sz w:val="22"/>
         </w:rPr>
-        <w:t>Зачёт исследования.</w:t>
+        <w:t>Инициативы очень аккуратно</w:t>
       </w:r>
       <w:r>
         <w:rPr>
@@ -3630,7 +3346,7 @@
           <w:color w:val="1A1A1A"/>
           <w:sz w:val="22"/>
         </w:rPr>
-        <w:t xml:space="preserve"> «Часть входа уже сделана — не платите за воздух».</w:t>
+        <w:t xml:space="preserve"> — как очередность работ из их плана, не как «купите пакет».</w:t>
       </w:r>
     </w:p>
     <w:p>
@@ -3646,7 +3362,7 @@
           <w:color w:val="1A1A1A"/>
           <w:sz w:val="22"/>
         </w:rPr>
-        <w:t>Узкий вход.</w:t>
+        <w:t>Зачёт исследования</w:t>
       </w:r>
       <w:r>
         <w:rPr>
@@ -3656,7 +3372,7 @@
           <w:color w:val="1A1A1A"/>
           <w:sz w:val="22"/>
         </w:rPr>
-        <w:t xml:space="preserve"> 90 дней и 250–350 тыс. проще, чем «750 навсегда».</w:t>
+        <w:t xml:space="preserve"> — часть входа уже сделана.</w:t>
       </w:r>
     </w:p>
     <w:p>
@@ -3672,7 +3388,7 @@
           <w:color w:val="1A1A1A"/>
           <w:sz w:val="22"/>
         </w:rPr>
-        <w:t>Разделить бюджеты.</w:t>
+        <w:t>Узкий вход</w:t>
       </w:r>
       <w:r>
         <w:rPr>
@@ -3682,7 +3398,7 @@
           <w:color w:val="1A1A1A"/>
           <w:sz w:val="22"/>
         </w:rPr>
-        <w:t xml:space="preserve"> Медиа и комиссии агентств отдельно — снимает страх «они освоят весь маркетинг».</w:t>
+        <w:t xml:space="preserve"> — 90 дней и 250–350 тыс., развитие текущего мандата.</w:t>
       </w:r>
     </w:p>
     <w:p>
@@ -3698,7 +3414,7 @@
           <w:color w:val="1A1A1A"/>
           <w:sz w:val="22"/>
         </w:rPr>
-        <w:t>Антипредложение.</w:t>
+        <w:t>Разделить бюджеты</w:t>
       </w:r>
       <w:r>
         <w:rPr>
@@ -3708,7 +3424,7 @@
           <w:color w:val="1A1A1A"/>
           <w:sz w:val="22"/>
         </w:rPr>
-        <w:t xml:space="preserve"> «Можно остаться на 200 тыс. SEO+dev — тогда контур агентств, языка и прогноза остаётся на вас». Честный развилка.</w:t>
+        <w:t xml:space="preserve"> — медиа и комиссии агентств отдельно.</w:t>
       </w:r>
     </w:p>
     <w:p>
@@ -3734,7 +3450,7 @@
           <w:color w:val="1A1A1A"/>
           <w:sz w:val="22"/>
         </w:rPr>
-        <w:t xml:space="preserve"> после согласия маркетинг-директора: роль · 90 дней · база · доборы · что не обещаем · 3 решения «да/нет».</w:t>
+        <w:t xml:space="preserve"> после мягкого «да» маркетинга: роль · 90 дней · база · доборы · что не обещаем.</w:t>
       </w:r>
     </w:p>
     <w:p>
@@ -3763,7 +3479,23 @@
           <w:color w:val="1A1A1A"/>
           <w:sz w:val="22"/>
         </w:rPr>
-        <w:t>не начинать с «нам нужна абонентка 350»;</w:t>
+        <w:t>не начинать с цены абонентки;</w:t>
+      </w:r>
+    </w:p>
+    <w:p>
+      <w:pPr>
+        <w:pStyle w:val="ListBullet"/>
+        <w:spacing w:line="276" w:lineRule="auto" w:after="60"/>
+      </w:pPr>
+      <w:r>
+        <w:rPr>
+          <w:rFonts w:ascii="Times New Roman" w:hAnsi="Times New Roman" w:eastAsia="Times New Roman"/>
+          <w:b w:val="0"/>
+          <w:i w:val="0"/>
+          <w:color w:val="1A1A1A"/>
+          <w:sz w:val="22"/>
+        </w:rPr>
+        <w:t>не ставить клиента в угол вопросом «а кто у вас за это отвечает?»;</w:t>
       </w:r>
     </w:p>
     <w:p>
@@ -3811,7 +3543,7 @@
           <w:color w:val="1A1A1A"/>
           <w:sz w:val="22"/>
         </w:rPr>
-        <w:t>не вываливать 50 инициатив без топ-приоритета;</w:t>
+        <w:t>не вываливать 50 инициатив;</w:t>
       </w:r>
     </w:p>
     <w:p>
@@ -3827,7 +3559,7 @@
           <w:color w:val="1A1A1A"/>
           <w:sz w:val="22"/>
         </w:rPr>
-        <w:t>не спорить с меморандумом клиента — опираться на него и усиливать.</w:t>
+        <w:t>не спорить с меморандумом — опираться на него и усиливать.</w:t>
       </w:r>
     </w:p>
     <w:p>
@@ -4267,7 +3999,7 @@
         <w:color w:val="1A1A1A"/>
         <w:sz w:val="18"/>
       </w:rPr>
-      <w:t>Стратегическое партнёрство IMPRO × СД · ЖК «Талай» · конфиденциально</w:t>
+      <w:t>ЖК «Талай» · IMPRO Group · конфиденциально</w:t>
     </w:r>
   </w:p>
 </w:ftr>

</xml_diff>